<commit_message>
DOCUMENTACION COMPLETA GENERADA POR CODIGO, CON GENERADOR PDF IMPLEMENTADO E ACTUALIZADO EL DOCUMENTO DE LAS PRUEBAS UNITARIAS CON LAS NUEVAS IMPLEMENTADAS
</commit_message>
<xml_diff>
--- a/Cadena de Hoteles/Informe-Pruebas-Unitarias.docx
+++ b/Cadena de Hoteles/Informe-Pruebas-Unitarias.docx
@@ -138,7 +138,7 @@
                 <w:color w:val="1A1A1A"/>
                 <w:sz w:val="20"/>
               </w:rPr>
-              <w:t>5 de abril de 2026</w:t>
+              <w:t>09 de abril de 2026</w:t>
             </w:r>
           </w:p>
         </w:tc>
@@ -286,7 +286,7 @@
           <w:sz w:val="20"/>
           <w:lang w:val="es-GT"/>
         </w:rPr>
-        <w:t xml:space="preserve">Se ejecutaron la totalidad de las pruebas unitarias del microservicio Hotel de la Cadena Miku Inn. Los resultados confirman que el sistema cumple con los criterios de calidad establecidos: los 229 </w:t>
+        <w:t xml:space="preserve">Se ejecutaron la totalidad de las pruebas unitarias del microservicio Hotel de la Cadena Miku Inn. Los resultados confirman que el sistema cumple con los criterios de calidad establecidos: los 249 </w:t>
       </w:r>
       <w:proofErr w:type="spellStart"/>
       <w:r>
@@ -340,7 +340,7 @@
                 <w:color w:val="FFFFFF"/>
                 <w:sz w:val="32"/>
               </w:rPr>
-              <w:t>229</w:t>
+              <w:t>249</w:t>
             </w:r>
           </w:p>
           <w:p>
@@ -373,7 +373,7 @@
                 <w:color w:val="FFFFFF"/>
                 <w:sz w:val="32"/>
               </w:rPr>
-              <w:t>229</w:t>
+              <w:t>249</w:t>
             </w:r>
           </w:p>
           <w:p>
@@ -439,7 +439,7 @@
                 <w:color w:val="FFFFFF"/>
                 <w:sz w:val="32"/>
               </w:rPr>
-              <w:t>30</w:t>
+              <w:t>35</w:t>
             </w:r>
           </w:p>
           <w:p>
@@ -472,7 +472,7 @@
                 <w:color w:val="FFFFFF"/>
                 <w:sz w:val="32"/>
               </w:rPr>
-              <w:t>41.2 s</w:t>
+              <w:t>54.504 s</w:t>
             </w:r>
           </w:p>
           <w:p>
@@ -510,7 +510,7 @@
           <w:sz w:val="20"/>
           <w:lang w:val="es-GT"/>
         </w:rPr>
-        <w:t xml:space="preserve">Los 229 </w:t>
+        <w:t xml:space="preserve">Los 249 </w:t>
       </w:r>
       <w:proofErr w:type="spellStart"/>
       <w:r>
@@ -528,7 +528,7 @@
           <w:sz w:val="20"/>
           <w:lang w:val="es-GT"/>
         </w:rPr>
-        <w:t xml:space="preserve"> se distribuyen en 30 archivos: 23 suites de servicios (</w:t>
+        <w:t xml:space="preserve"> se distribuyen en 35 archivos: 28 suites de servicios (</w:t>
       </w:r>
       <w:proofErr w:type="spellStart"/>
       <w:r>
@@ -14730,7 +14730,7 @@
           <w:color w:val="445060"/>
           <w:sz w:val="18"/>
         </w:rPr>
-        <w:t xml:space="preserve">  7 tests]</w:t>
+        <w:t xml:space="preserve">  10 tests]</w:t>
       </w:r>
     </w:p>
     <w:tbl>
@@ -15292,6 +15292,162 @@
               </w:rPr>
               <w:t xml:space="preserve"> de tarjeta.</w:t>
             </w:r>
+          </w:p>
+        </w:tc>
+      </w:tr>
+      <w:tr>
+        <w:trPr>
+          <w:jc w:val="center"/>
+        </w:trPr>
+        <w:tc>
+          <w:tcPr>
+            <w:tcW w:w="4533" w:type="dxa"/>
+            <w:shd w:val="clear" w:color="auto" w:fill="F5F7FA"/>
+          </w:tcPr>
+          <w:p>
+            <w:pPr>
+              <w:spacing w:before="60" w:after="60"/>
+              <w:jc w:val="both"/>
+            </w:pPr>
+            <w:r>
+              <w:rPr>
+                <w:b/>
+                <w:color w:val="3A527C"/>
+                <w:sz w:val="15"/>
+              </w:rPr>
+              <w:t>procesarPago_conTokenAlianzaValido_aplicaDescuentoYMarcaTokenUsado</w:t>
+            </w:r>
+          </w:p>
+        </w:tc>
+        <w:tc>
+          <w:tcPr>
+            <w:tcW w:w="4533" w:type="dxa"/>
+            <w:shd w:val="clear" w:color="auto" w:fill="F5F7FA"/>
+          </w:tcPr>
+          <w:p>
+            <w:pPr>
+              <w:spacing w:before="60" w:after="60"/>
+              <w:jc w:val="both"/>
+              <w:rPr>
+                <w:lang w:val="es-GT"/>
+              </w:rPr>
+            </w:pPr>
+            <w:r>
+              <w:rPr>
+                <w:color w:val="1A1A1A"/>
+                <w:sz w:val="17"/>
+                <w:lang w:val="es-GT"/>
+              </w:rPr>
+              <w:t>Con token de alianza valido, se aplica el 10% de descuento, se actualiza el total de la reservacion y sus detalles, y el token queda marcado como usado.</w:t>
+            </w:r>
+            <w:proofErr w:type="spellStart"/>
+            <w:proofErr w:type="spellEnd"/>
+            <w:proofErr w:type="spellStart"/>
+            <w:proofErr w:type="spellEnd"/>
+          </w:p>
+        </w:tc>
+      </w:tr>
+      <w:tr>
+        <w:trPr>
+          <w:jc w:val="center"/>
+        </w:trPr>
+        <w:tc>
+          <w:tcPr>
+            <w:tcW w:w="4533" w:type="dxa"/>
+            <w:shd w:val="clear" w:color="auto" w:fill="F5F7FA"/>
+          </w:tcPr>
+          <w:p>
+            <w:pPr>
+              <w:spacing w:before="60" w:after="60"/>
+              <w:jc w:val="both"/>
+            </w:pPr>
+            <w:r>
+              <w:rPr>
+                <w:b/>
+                <w:color w:val="3A527C"/>
+                <w:sz w:val="15"/>
+              </w:rPr>
+              <w:t>procesarPago_tokenAlianzaInvalido_lanzaIllegalArgumentException</w:t>
+            </w:r>
+          </w:p>
+        </w:tc>
+        <w:tc>
+          <w:tcPr>
+            <w:tcW w:w="4533" w:type="dxa"/>
+            <w:shd w:val="clear" w:color="auto" w:fill="F5F7FA"/>
+          </w:tcPr>
+          <w:p>
+            <w:pPr>
+              <w:spacing w:before="60" w:after="60"/>
+              <w:jc w:val="both"/>
+              <w:rPr>
+                <w:lang w:val="es-GT"/>
+              </w:rPr>
+            </w:pPr>
+            <w:r>
+              <w:rPr>
+                <w:color w:val="1A1A1A"/>
+                <w:sz w:val="17"/>
+                <w:lang w:val="es-GT"/>
+              </w:rPr>
+              <w:t>Un token de alianza invalido, ya usado o expirado lanza IllegalArgumentException sin confirmar la reservacion ni marcar el token.</w:t>
+            </w:r>
+            <w:proofErr w:type="spellStart"/>
+            <w:proofErr w:type="spellEnd"/>
+            <w:proofErr w:type="spellStart"/>
+            <w:proofErr w:type="spellEnd"/>
+          </w:p>
+        </w:tc>
+      </w:tr>
+      <w:tr>
+        <w:trPr>
+          <w:jc w:val="center"/>
+        </w:trPr>
+        <w:tc>
+          <w:tcPr>
+            <w:tcW w:w="4533" w:type="dxa"/>
+            <w:shd w:val="clear" w:color="auto" w:fill="F5F7FA"/>
+          </w:tcPr>
+          <w:p>
+            <w:pPr>
+              <w:spacing w:before="60" w:after="60"/>
+              <w:jc w:val="both"/>
+            </w:pPr>
+            <w:r>
+              <w:rPr>
+                <w:b/>
+                <w:color w:val="3A527C"/>
+                <w:sz w:val="15"/>
+              </w:rPr>
+              <w:t>procesarPago_tokenAlianzaBlanco_procesaSinDescuento</w:t>
+            </w:r>
+          </w:p>
+        </w:tc>
+        <w:tc>
+          <w:tcPr>
+            <w:tcW w:w="4533" w:type="dxa"/>
+            <w:shd w:val="clear" w:color="auto" w:fill="F5F7FA"/>
+          </w:tcPr>
+          <w:p>
+            <w:pPr>
+              <w:spacing w:before="60" w:after="60"/>
+              <w:jc w:val="both"/>
+              <w:rPr>
+                <w:lang w:val="es-GT"/>
+              </w:rPr>
+            </w:pPr>
+            <w:r>
+              <w:rPr>
+                <w:color w:val="1A1A1A"/>
+                <w:sz w:val="17"/>
+                <w:lang w:val="es-GT"/>
+              </w:rPr>
+              <w:t>Un token en blanco se ignora; el pago se procesa sin descuento y sin consultar el repositorio de tokens de alianza.</w:t>
+            </w:r>
+            <w:proofErr w:type="spellStart"/>
+            <w:proofErr w:type="spellEnd"/>
+            <w:proofErr w:type="spellStart"/>
+            <w:proofErr w:type="spellEnd"/>
           </w:p>
         </w:tc>
       </w:tr>
@@ -18555,6 +18711,1598 @@
           <w:b/>
           <w:color w:val="1E283C"/>
         </w:rPr>
+        <w:t>AuthServiceIntegrationTest</w:t>
+      </w:r>
+      <w:proofErr w:type="spellEnd"/>
+      <w:r>
+        <w:rPr>
+          <w:i/>
+          <w:color w:val="445060"/>
+          <w:sz w:val="18"/>
+        </w:rPr>
+        <w:t xml:space="preserve">  [Integracion  •</w:t>
+      </w:r>
+      <w:proofErr w:type="gramEnd"/>
+      <w:r>
+        <w:rPr>
+          <w:i/>
+          <w:color w:val="445060"/>
+          <w:sz w:val="18"/>
+        </w:rPr>
+        <w:t xml:space="preserve">  4 tests]</w:t>
+      </w:r>
+    </w:p>
+    <w:tbl>
+      <w:tblPr>
+        <w:tblStyle w:val="Tablaconcuadrcula"/>
+        <w:tblW w:w="0" w:type="auto"/>
+        <w:jc w:val="center"/>
+        <w:tblLook w:val="04A0" w:firstRow="1" w:lastRow="0" w:firstColumn="1" w:lastColumn="0" w:noHBand="0" w:noVBand="1"/>
+      </w:tblPr>
+      <w:tblGrid>
+        <w:gridCol w:w="5361"/>
+        <w:gridCol w:w="3695"/>
+      </w:tblGrid>
+      <w:tr>
+        <w:trPr>
+          <w:jc w:val="center"/>
+        </w:trPr>
+        <w:tc>
+          <w:tcPr>
+            <w:tcW w:w="3685" w:type="dxa"/>
+            <w:shd w:val="clear" w:color="auto" w:fill="2C3A52"/>
+          </w:tcPr>
+          <w:p>
+            <w:pPr>
+              <w:spacing w:before="60" w:after="60"/>
+              <w:jc w:val="both"/>
+            </w:pPr>
+            <w:r>
+              <w:rPr>
+                <w:b/>
+                <w:color w:val="FFFFFF"/>
+                <w:sz w:val="17"/>
+              </w:rPr>
+              <w:t>Nombre del test</w:t>
+            </w:r>
+          </w:p>
+        </w:tc>
+        <w:tc>
+          <w:tcPr>
+            <w:tcW w:w="4762" w:type="dxa"/>
+            <w:shd w:val="clear" w:color="auto" w:fill="2C3A52"/>
+          </w:tcPr>
+          <w:p>
+            <w:pPr>
+              <w:spacing w:before="60" w:after="60"/>
+              <w:jc w:val="both"/>
+            </w:pPr>
+            <w:r>
+              <w:rPr>
+                <w:b/>
+                <w:color w:val="FFFFFF"/>
+                <w:sz w:val="17"/>
+              </w:rPr>
+              <w:t>Que verifica</w:t>
+            </w:r>
+          </w:p>
+        </w:tc>
+      </w:tr>
+      <w:tr>
+        <w:trPr>
+          <w:jc w:val="center"/>
+        </w:trPr>
+        <w:tc>
+          <w:tcPr>
+            <w:tcW w:w="4533" w:type="dxa"/>
+            <w:shd w:val="clear" w:color="auto" w:fill="F5F7FA"/>
+          </w:tcPr>
+          <w:p>
+            <w:pPr>
+              <w:spacing w:before="60" w:after="60"/>
+              <w:jc w:val="both"/>
+            </w:pPr>
+            <w:r>
+              <w:rPr>
+                <w:b/>
+                <w:color w:val="3A527C"/>
+                <w:sz w:val="15"/>
+              </w:rPr>
+              <w:t>loginExitosoConUsername</w:t>
+            </w:r>
+          </w:p>
+        </w:tc>
+        <w:tc>
+          <w:tcPr>
+            <w:tcW w:w="4533" w:type="dxa"/>
+            <w:shd w:val="clear" w:color="auto" w:fill="F5F7FA"/>
+          </w:tcPr>
+          <w:p>
+            <w:pPr>
+              <w:spacing w:before="60" w:after="60"/>
+              <w:jc w:val="both"/>
+              <w:rPr>
+                <w:lang w:val="es-GT"/>
+              </w:rPr>
+            </w:pPr>
+            <w:r>
+              <w:rPr>
+                <w:color w:val="1A1A1A"/>
+                <w:sz w:val="17"/>
+                <w:lang w:val="es-GT"/>
+              </w:rPr>
+              <w:t xml:space="preserve">Login exitoso con username real de Oracle: el service retorna token JWT valido y los datos del usuario correctamente.</w:t>
+            </w:r>
+            <w:proofErr w:type="spellStart"/>
+            <w:r>
+              <w:rPr>
+                <w:color w:val="1A1A1A"/>
+                <w:sz w:val="17"/>
+                <w:lang w:val="es-GT"/>
+              </w:rPr>
+              <w:t/>
+            </w:r>
+            <w:proofErr w:type="spellEnd"/>
+            <w:r>
+              <w:rPr>
+                <w:color w:val="1A1A1A"/>
+                <w:sz w:val="17"/>
+                <w:lang w:val="es-GT"/>
+              </w:rPr>
+              <w:t xml:space="preserve"/>
+            </w:r>
+          </w:p>
+        </w:tc>
+      </w:tr>
+      <w:tr>
+        <w:trPr>
+          <w:jc w:val="center"/>
+        </w:trPr>
+        <w:tc>
+          <w:tcPr>
+            <w:tcW w:w="4533" w:type="dxa"/>
+            <w:shd w:val="clear" w:color="auto" w:fill="F5F7FA"/>
+          </w:tcPr>
+          <w:p>
+            <w:pPr>
+              <w:spacing w:before="60" w:after="60"/>
+              <w:jc w:val="both"/>
+            </w:pPr>
+            <w:r>
+              <w:rPr>
+                <w:b/>
+                <w:color w:val="3A527C"/>
+                <w:sz w:val="15"/>
+              </w:rPr>
+              <w:t>loginExitosoConCorreo</w:t>
+            </w:r>
+          </w:p>
+        </w:tc>
+        <w:tc>
+          <w:tcPr>
+            <w:tcW w:w="4533" w:type="dxa"/>
+            <w:shd w:val="clear" w:color="auto" w:fill="F5F7FA"/>
+          </w:tcPr>
+          <w:p>
+            <w:pPr>
+              <w:spacing w:before="60" w:after="60"/>
+              <w:jc w:val="both"/>
+              <w:rPr>
+                <w:lang w:val="es-GT"/>
+              </w:rPr>
+            </w:pPr>
+            <w:r>
+              <w:rPr>
+                <w:color w:val="1A1A1A"/>
+                <w:sz w:val="17"/>
+                <w:lang w:val="es-GT"/>
+              </w:rPr>
+              <w:t xml:space="preserve">Login exitoso con correo electronico real de Oracle: el token se genera y el username coincide con el registrado.</w:t>
+            </w:r>
+            <w:proofErr w:type="spellStart"/>
+            <w:r>
+              <w:rPr>
+                <w:color w:val="1A1A1A"/>
+                <w:sz w:val="17"/>
+                <w:lang w:val="es-GT"/>
+              </w:rPr>
+              <w:t/>
+            </w:r>
+            <w:proofErr w:type="spellEnd"/>
+            <w:r>
+              <w:rPr>
+                <w:color w:val="1A1A1A"/>
+                <w:sz w:val="17"/>
+                <w:lang w:val="es-GT"/>
+              </w:rPr>
+              <w:t xml:space="preserve"/>
+            </w:r>
+          </w:p>
+        </w:tc>
+      </w:tr>
+      <w:tr>
+        <w:trPr>
+          <w:jc w:val="center"/>
+        </w:trPr>
+        <w:tc>
+          <w:tcPr>
+            <w:tcW w:w="4533" w:type="dxa"/>
+            <w:shd w:val="clear" w:color="auto" w:fill="F5F7FA"/>
+          </w:tcPr>
+          <w:p>
+            <w:pPr>
+              <w:spacing w:before="60" w:after="60"/>
+              <w:jc w:val="both"/>
+            </w:pPr>
+            <w:r>
+              <w:rPr>
+                <w:b/>
+                <w:color w:val="3A527C"/>
+                <w:sz w:val="15"/>
+              </w:rPr>
+              <w:t>loginFallaUsuarioInexistente</w:t>
+            </w:r>
+          </w:p>
+        </w:tc>
+        <w:tc>
+          <w:tcPr>
+            <w:tcW w:w="4533" w:type="dxa"/>
+            <w:shd w:val="clear" w:color="auto" w:fill="F5F7FA"/>
+          </w:tcPr>
+          <w:p>
+            <w:pPr>
+              <w:spacing w:before="60" w:after="60"/>
+              <w:jc w:val="both"/>
+              <w:rPr>
+                <w:lang w:val="es-GT"/>
+              </w:rPr>
+            </w:pPr>
+            <w:r>
+              <w:rPr>
+                <w:color w:val="1A1A1A"/>
+                <w:sz w:val="17"/>
+                <w:lang w:val="es-GT"/>
+              </w:rPr>
+              <w:t xml:space="preserve">Lanza CredencialesInvalidasException cuando el identificador no existe en la tabla Usuario de Oracle.</w:t>
+            </w:r>
+            <w:proofErr w:type="spellStart"/>
+            <w:r>
+              <w:rPr>
+                <w:color w:val="1A1A1A"/>
+                <w:sz w:val="17"/>
+                <w:lang w:val="es-GT"/>
+              </w:rPr>
+              <w:t/>
+            </w:r>
+            <w:proofErr w:type="spellEnd"/>
+            <w:r>
+              <w:rPr>
+                <w:color w:val="1A1A1A"/>
+                <w:sz w:val="17"/>
+                <w:lang w:val="es-GT"/>
+              </w:rPr>
+              <w:t xml:space="preserve"/>
+            </w:r>
+          </w:p>
+        </w:tc>
+      </w:tr>
+      <w:tr>
+        <w:trPr>
+          <w:jc w:val="center"/>
+        </w:trPr>
+        <w:tc>
+          <w:tcPr>
+            <w:tcW w:w="4533" w:type="dxa"/>
+            <w:shd w:val="clear" w:color="auto" w:fill="F5F7FA"/>
+          </w:tcPr>
+          <w:p>
+            <w:pPr>
+              <w:spacing w:before="60" w:after="60"/>
+              <w:jc w:val="both"/>
+            </w:pPr>
+            <w:r>
+              <w:rPr>
+                <w:b/>
+                <w:color w:val="3A527C"/>
+                <w:sz w:val="15"/>
+              </w:rPr>
+              <w:t>loginFallaContrasenaIncorrecta</w:t>
+            </w:r>
+          </w:p>
+        </w:tc>
+        <w:tc>
+          <w:tcPr>
+            <w:tcW w:w="4533" w:type="dxa"/>
+            <w:shd w:val="clear" w:color="auto" w:fill="F5F7FA"/>
+          </w:tcPr>
+          <w:p>
+            <w:pPr>
+              <w:spacing w:before="60" w:after="60"/>
+              <w:jc w:val="both"/>
+              <w:rPr>
+                <w:lang w:val="es-GT"/>
+              </w:rPr>
+            </w:pPr>
+            <w:r>
+              <w:rPr>
+                <w:color w:val="1A1A1A"/>
+                <w:sz w:val="17"/>
+                <w:lang w:val="es-GT"/>
+              </w:rPr>
+              <w:t xml:space="preserve">Lanza CredencialesInvalidasException cuando la contrasena no coincide con el hash BCrypt almacenado en Oracle.</w:t>
+            </w:r>
+            <w:proofErr w:type="spellStart"/>
+            <w:r>
+              <w:rPr>
+                <w:color w:val="1A1A1A"/>
+                <w:sz w:val="17"/>
+                <w:lang w:val="es-GT"/>
+              </w:rPr>
+              <w:t/>
+            </w:r>
+            <w:proofErr w:type="spellEnd"/>
+            <w:r>
+              <w:rPr>
+                <w:color w:val="1A1A1A"/>
+                <w:sz w:val="17"/>
+                <w:lang w:val="es-GT"/>
+              </w:rPr>
+              <w:t xml:space="preserve"/>
+            </w:r>
+          </w:p>
+        </w:tc>
+      </w:tr>
+    </w:tbl>
+    <w:p/>
+    <w:p>
+      <w:pPr>
+        <w:pBdr>
+          <w:bottom w:val="single" w:sz="4" w:space="4" w:color="1E283C"/>
+        </w:pBdr>
+        <w:spacing w:before="200" w:after="40"/>
+        <w:jc w:val="both"/>
+      </w:pPr>
+      <w:proofErr w:type="spellStart"/>
+      <w:proofErr w:type="gramStart"/>
+      <w:r>
+        <w:rPr>
+          <w:b/>
+          <w:color w:val="1E283C"/>
+        </w:rPr>
+        <w:t>BusquedaServiceIntegrationTest</w:t>
+      </w:r>
+      <w:proofErr w:type="spellEnd"/>
+      <w:r>
+        <w:rPr>
+          <w:i/>
+          <w:color w:val="445060"/>
+          <w:sz w:val="18"/>
+        </w:rPr>
+        <w:t xml:space="preserve">  [Integracion  •</w:t>
+      </w:r>
+      <w:proofErr w:type="gramEnd"/>
+      <w:r>
+        <w:rPr>
+          <w:i/>
+          <w:color w:val="445060"/>
+          <w:sz w:val="18"/>
+        </w:rPr>
+        <w:t xml:space="preserve">  4 tests]</w:t>
+      </w:r>
+    </w:p>
+    <w:tbl>
+      <w:tblPr>
+        <w:tblStyle w:val="Tablaconcuadrcula"/>
+        <w:tblW w:w="0" w:type="auto"/>
+        <w:jc w:val="center"/>
+        <w:tblLook w:val="04A0" w:firstRow="1" w:lastRow="0" w:firstColumn="1" w:lastColumn="0" w:noHBand="0" w:noVBand="1"/>
+      </w:tblPr>
+      <w:tblGrid>
+        <w:gridCol w:w="5361"/>
+        <w:gridCol w:w="3695"/>
+      </w:tblGrid>
+      <w:tr>
+        <w:trPr>
+          <w:jc w:val="center"/>
+        </w:trPr>
+        <w:tc>
+          <w:tcPr>
+            <w:tcW w:w="3685" w:type="dxa"/>
+            <w:shd w:val="clear" w:color="auto" w:fill="2C3A52"/>
+          </w:tcPr>
+          <w:p>
+            <w:pPr>
+              <w:spacing w:before="60" w:after="60"/>
+              <w:jc w:val="both"/>
+            </w:pPr>
+            <w:r>
+              <w:rPr>
+                <w:b/>
+                <w:color w:val="FFFFFF"/>
+                <w:sz w:val="17"/>
+              </w:rPr>
+              <w:t>Nombre del test</w:t>
+            </w:r>
+          </w:p>
+        </w:tc>
+        <w:tc>
+          <w:tcPr>
+            <w:tcW w:w="4762" w:type="dxa"/>
+            <w:shd w:val="clear" w:color="auto" w:fill="2C3A52"/>
+          </w:tcPr>
+          <w:p>
+            <w:pPr>
+              <w:spacing w:before="60" w:after="60"/>
+              <w:jc w:val="both"/>
+            </w:pPr>
+            <w:r>
+              <w:rPr>
+                <w:b/>
+                <w:color w:val="FFFFFF"/>
+                <w:sz w:val="17"/>
+              </w:rPr>
+              <w:t>Que verifica</w:t>
+            </w:r>
+          </w:p>
+        </w:tc>
+      </w:tr>
+      <w:tr>
+        <w:trPr>
+          <w:jc w:val="center"/>
+        </w:trPr>
+        <w:tc>
+          <w:tcPr>
+            <w:tcW w:w="4533" w:type="dxa"/>
+            <w:shd w:val="clear" w:color="auto" w:fill="F5F7FA"/>
+          </w:tcPr>
+          <w:p>
+            <w:pPr>
+              <w:spacing w:before="60" w:after="60"/>
+              <w:jc w:val="both"/>
+            </w:pPr>
+            <w:r>
+              <w:rPr>
+                <w:b/>
+                <w:color w:val="3A527C"/>
+                <w:sz w:val="15"/>
+              </w:rPr>
+              <w:t>busquedaConCiudadRealRetornaHoteles</w:t>
+            </w:r>
+          </w:p>
+        </w:tc>
+        <w:tc>
+          <w:tcPr>
+            <w:tcW w:w="4533" w:type="dxa"/>
+            <w:shd w:val="clear" w:color="auto" w:fill="F5F7FA"/>
+          </w:tcPr>
+          <w:p>
+            <w:pPr>
+              <w:spacing w:before="60" w:after="60"/>
+              <w:jc w:val="both"/>
+              <w:rPr>
+                <w:lang w:val="es-GT"/>
+              </w:rPr>
+            </w:pPr>
+            <w:r>
+              <w:rPr>
+                <w:color w:val="1A1A1A"/>
+                <w:sz w:val="17"/>
+                <w:lang w:val="es-GT"/>
+              </w:rPr>
+              <w:t xml:space="preserve">Busqueda con ciudad real de Oracle retorna hoteles enriquecidos con imagenes, amenidades y tipos de habitacion inicializados.</w:t>
+            </w:r>
+            <w:proofErr w:type="spellStart"/>
+            <w:r>
+              <w:rPr>
+                <w:color w:val="1A1A1A"/>
+                <w:sz w:val="17"/>
+                <w:lang w:val="es-GT"/>
+              </w:rPr>
+              <w:t/>
+            </w:r>
+            <w:proofErr w:type="spellEnd"/>
+            <w:r>
+              <w:rPr>
+                <w:color w:val="1A1A1A"/>
+                <w:sz w:val="17"/>
+                <w:lang w:val="es-GT"/>
+              </w:rPr>
+              <w:t xml:space="preserve"/>
+            </w:r>
+          </w:p>
+        </w:tc>
+      </w:tr>
+      <w:tr>
+        <w:trPr>
+          <w:jc w:val="center"/>
+        </w:trPr>
+        <w:tc>
+          <w:tcPr>
+            <w:tcW w:w="4533" w:type="dxa"/>
+            <w:shd w:val="clear" w:color="auto" w:fill="F5F7FA"/>
+          </w:tcPr>
+          <w:p>
+            <w:pPr>
+              <w:spacing w:before="60" w:after="60"/>
+              <w:jc w:val="both"/>
+            </w:pPr>
+            <w:r>
+              <w:rPr>
+                <w:b/>
+                <w:color w:val="3A527C"/>
+                <w:sz w:val="15"/>
+              </w:rPr>
+              <w:t>busquedaRegistraEventoEnOracle</w:t>
+            </w:r>
+          </w:p>
+        </w:tc>
+        <w:tc>
+          <w:tcPr>
+            <w:tcW w:w="4533" w:type="dxa"/>
+            <w:shd w:val="clear" w:color="auto" w:fill="F5F7FA"/>
+          </w:tcPr>
+          <w:p>
+            <w:pPr>
+              <w:spacing w:before="60" w:after="60"/>
+              <w:jc w:val="both"/>
+              <w:rPr>
+                <w:lang w:val="es-GT"/>
+              </w:rPr>
+            </w:pPr>
+            <w:r>
+              <w:rPr>
+                <w:color w:val="1A1A1A"/>
+                <w:sz w:val="17"/>
+                <w:lang w:val="es-GT"/>
+              </w:rPr>
+              <w:t xml:space="preserve">Busqueda autenticada registra el evento en la tabla Busqueda de Oracle con el ID del usuario correcto.</w:t>
+            </w:r>
+            <w:proofErr w:type="spellStart"/>
+            <w:r>
+              <w:rPr>
+                <w:color w:val="1A1A1A"/>
+                <w:sz w:val="17"/>
+                <w:lang w:val="es-GT"/>
+              </w:rPr>
+              <w:t/>
+            </w:r>
+            <w:proofErr w:type="spellEnd"/>
+            <w:r>
+              <w:rPr>
+                <w:color w:val="1A1A1A"/>
+                <w:sz w:val="17"/>
+                <w:lang w:val="es-GT"/>
+              </w:rPr>
+              <w:t xml:space="preserve"/>
+            </w:r>
+          </w:p>
+        </w:tc>
+      </w:tr>
+      <w:tr>
+        <w:trPr>
+          <w:jc w:val="center"/>
+        </w:trPr>
+        <w:tc>
+          <w:tcPr>
+            <w:tcW w:w="4533" w:type="dxa"/>
+            <w:shd w:val="clear" w:color="auto" w:fill="F5F7FA"/>
+          </w:tcPr>
+          <w:p>
+            <w:pPr>
+              <w:spacing w:before="60" w:after="60"/>
+              <w:jc w:val="both"/>
+            </w:pPr>
+            <w:r>
+              <w:rPr>
+                <w:b/>
+                <w:color w:val="3A527C"/>
+                <w:sz w:val="15"/>
+              </w:rPr>
+              <w:t>busquedaAnonimaRegistraEventoConUsuarioNull</w:t>
+            </w:r>
+          </w:p>
+        </w:tc>
+        <w:tc>
+          <w:tcPr>
+            <w:tcW w:w="4533" w:type="dxa"/>
+            <w:shd w:val="clear" w:color="auto" w:fill="F5F7FA"/>
+          </w:tcPr>
+          <w:p>
+            <w:pPr>
+              <w:spacing w:before="60" w:after="60"/>
+              <w:jc w:val="both"/>
+              <w:rPr>
+                <w:lang w:val="es-GT"/>
+              </w:rPr>
+            </w:pPr>
+            <w:r>
+              <w:rPr>
+                <w:color w:val="1A1A1A"/>
+                <w:sz w:val="17"/>
+                <w:lang w:val="es-GT"/>
+              </w:rPr>
+              <w:t xml:space="preserve">Busqueda anonima registra el evento en la tabla Busqueda de Oracle con UsuarioID null.</w:t>
+            </w:r>
+            <w:proofErr w:type="spellStart"/>
+            <w:r>
+              <w:rPr>
+                <w:color w:val="1A1A1A"/>
+                <w:sz w:val="17"/>
+                <w:lang w:val="es-GT"/>
+              </w:rPr>
+              <w:t/>
+            </w:r>
+            <w:proofErr w:type="spellEnd"/>
+            <w:r>
+              <w:rPr>
+                <w:color w:val="1A1A1A"/>
+                <w:sz w:val="17"/>
+                <w:lang w:val="es-GT"/>
+              </w:rPr>
+              <w:t xml:space="preserve"/>
+            </w:r>
+          </w:p>
+        </w:tc>
+      </w:tr>
+      <w:tr>
+        <w:trPr>
+          <w:jc w:val="center"/>
+        </w:trPr>
+        <w:tc>
+          <w:tcPr>
+            <w:tcW w:w="4533" w:type="dxa"/>
+            <w:shd w:val="clear" w:color="auto" w:fill="F5F7FA"/>
+          </w:tcPr>
+          <w:p>
+            <w:pPr>
+              <w:spacing w:before="60" w:after="60"/>
+              <w:jc w:val="both"/>
+            </w:pPr>
+            <w:r>
+              <w:rPr>
+                <w:b/>
+                <w:color w:val="3A527C"/>
+                <w:sz w:val="15"/>
+              </w:rPr>
+              <w:t>busquedaFallaCiudadInexistente</w:t>
+            </w:r>
+          </w:p>
+        </w:tc>
+        <w:tc>
+          <w:tcPr>
+            <w:tcW w:w="4533" w:type="dxa"/>
+            <w:shd w:val="clear" w:color="auto" w:fill="F5F7FA"/>
+          </w:tcPr>
+          <w:p>
+            <w:pPr>
+              <w:spacing w:before="60" w:after="60"/>
+              <w:jc w:val="both"/>
+              <w:rPr>
+                <w:lang w:val="es-GT"/>
+              </w:rPr>
+            </w:pPr>
+            <w:r>
+              <w:rPr>
+                <w:color w:val="1A1A1A"/>
+                <w:sz w:val="17"/>
+                <w:lang w:val="es-GT"/>
+              </w:rPr>
+              <w:t xml:space="preserve">Lanza IllegalArgumentException con ciudad inexistente y Oracle no registra ninguna busqueda en la tabla.</w:t>
+            </w:r>
+            <w:proofErr w:type="spellStart"/>
+            <w:r>
+              <w:rPr>
+                <w:color w:val="1A1A1A"/>
+                <w:sz w:val="17"/>
+                <w:lang w:val="es-GT"/>
+              </w:rPr>
+              <w:t/>
+            </w:r>
+            <w:proofErr w:type="spellEnd"/>
+            <w:r>
+              <w:rPr>
+                <w:color w:val="1A1A1A"/>
+                <w:sz w:val="17"/>
+                <w:lang w:val="es-GT"/>
+              </w:rPr>
+              <w:t xml:space="preserve"/>
+            </w:r>
+          </w:p>
+        </w:tc>
+      </w:tr>
+    </w:tbl>
+    <w:p/>
+    <w:p>
+      <w:pPr>
+        <w:pBdr>
+          <w:bottom w:val="single" w:sz="4" w:space="4" w:color="1E283C"/>
+        </w:pBdr>
+        <w:spacing w:before="200" w:after="40"/>
+        <w:jc w:val="both"/>
+      </w:pPr>
+      <w:proofErr w:type="spellStart"/>
+      <w:proofErr w:type="gramStart"/>
+      <w:r>
+        <w:rPr>
+          <w:b/>
+          <w:color w:val="1E283C"/>
+        </w:rPr>
+        <w:t>CancelacionServiceIntegrationTest</w:t>
+      </w:r>
+      <w:proofErr w:type="spellEnd"/>
+      <w:r>
+        <w:rPr>
+          <w:i/>
+          <w:color w:val="445060"/>
+          <w:sz w:val="18"/>
+        </w:rPr>
+        <w:t xml:space="preserve">  [Integracion  •</w:t>
+      </w:r>
+      <w:proofErr w:type="gramEnd"/>
+      <w:r>
+        <w:rPr>
+          <w:i/>
+          <w:color w:val="445060"/>
+          <w:sz w:val="18"/>
+        </w:rPr>
+        <w:t xml:space="preserve">  3 tests]</w:t>
+      </w:r>
+    </w:p>
+    <w:tbl>
+      <w:tblPr>
+        <w:tblStyle w:val="Tablaconcuadrcula"/>
+        <w:tblW w:w="0" w:type="auto"/>
+        <w:jc w:val="center"/>
+        <w:tblLook w:val="04A0" w:firstRow="1" w:lastRow="0" w:firstColumn="1" w:lastColumn="0" w:noHBand="0" w:noVBand="1"/>
+      </w:tblPr>
+      <w:tblGrid>
+        <w:gridCol w:w="5361"/>
+        <w:gridCol w:w="3695"/>
+      </w:tblGrid>
+      <w:tr>
+        <w:trPr>
+          <w:jc w:val="center"/>
+        </w:trPr>
+        <w:tc>
+          <w:tcPr>
+            <w:tcW w:w="3685" w:type="dxa"/>
+            <w:shd w:val="clear" w:color="auto" w:fill="2C3A52"/>
+          </w:tcPr>
+          <w:p>
+            <w:pPr>
+              <w:spacing w:before="60" w:after="60"/>
+              <w:jc w:val="both"/>
+            </w:pPr>
+            <w:r>
+              <w:rPr>
+                <w:b/>
+                <w:color w:val="FFFFFF"/>
+                <w:sz w:val="17"/>
+              </w:rPr>
+              <w:t>Nombre del test</w:t>
+            </w:r>
+          </w:p>
+        </w:tc>
+        <w:tc>
+          <w:tcPr>
+            <w:tcW w:w="4762" w:type="dxa"/>
+            <w:shd w:val="clear" w:color="auto" w:fill="2C3A52"/>
+          </w:tcPr>
+          <w:p>
+            <w:pPr>
+              <w:spacing w:before="60" w:after="60"/>
+              <w:jc w:val="both"/>
+            </w:pPr>
+            <w:r>
+              <w:rPr>
+                <w:b/>
+                <w:color w:val="FFFFFF"/>
+                <w:sz w:val="17"/>
+              </w:rPr>
+              <w:t>Que verifica</w:t>
+            </w:r>
+          </w:p>
+        </w:tc>
+      </w:tr>
+      <w:tr>
+        <w:trPr>
+          <w:jc w:val="center"/>
+        </w:trPr>
+        <w:tc>
+          <w:tcPr>
+            <w:tcW w:w="4533" w:type="dxa"/>
+            <w:shd w:val="clear" w:color="auto" w:fill="F5F7FA"/>
+          </w:tcPr>
+          <w:p>
+            <w:pPr>
+              <w:spacing w:before="60" w:after="60"/>
+              <w:jc w:val="both"/>
+            </w:pPr>
+            <w:r>
+              <w:rPr>
+                <w:b/>
+                <w:color w:val="3A527C"/>
+                <w:sz w:val="15"/>
+              </w:rPr>
+              <w:t>cancelacionExitosaPersistidaEnOracle</w:t>
+            </w:r>
+          </w:p>
+        </w:tc>
+        <w:tc>
+          <w:tcPr>
+            <w:tcW w:w="4533" w:type="dxa"/>
+            <w:shd w:val="clear" w:color="auto" w:fill="F5F7FA"/>
+          </w:tcPr>
+          <w:p>
+            <w:pPr>
+              <w:spacing w:before="60" w:after="60"/>
+              <w:jc w:val="both"/>
+              <w:rPr>
+                <w:lang w:val="es-GT"/>
+              </w:rPr>
+            </w:pPr>
+            <w:r>
+              <w:rPr>
+                <w:color w:val="1A1A1A"/>
+                <w:sz w:val="17"/>
+                <w:lang w:val="es-GT"/>
+              </w:rPr>
+              <w:t xml:space="preserve">Cancela reservacion confirmada con check-in lejano y Oracle persiste el cambio de estado a Cancelada.</w:t>
+            </w:r>
+            <w:proofErr w:type="spellStart"/>
+            <w:r>
+              <w:rPr>
+                <w:color w:val="1A1A1A"/>
+                <w:sz w:val="17"/>
+                <w:lang w:val="es-GT"/>
+              </w:rPr>
+              <w:t/>
+            </w:r>
+            <w:proofErr w:type="spellEnd"/>
+            <w:r>
+              <w:rPr>
+                <w:color w:val="1A1A1A"/>
+                <w:sz w:val="17"/>
+                <w:lang w:val="es-GT"/>
+              </w:rPr>
+              <w:t xml:space="preserve"/>
+            </w:r>
+          </w:p>
+        </w:tc>
+      </w:tr>
+      <w:tr>
+        <w:trPr>
+          <w:jc w:val="center"/>
+        </w:trPr>
+        <w:tc>
+          <w:tcPr>
+            <w:tcW w:w="4533" w:type="dxa"/>
+            <w:shd w:val="clear" w:color="auto" w:fill="F5F7FA"/>
+          </w:tcPr>
+          <w:p>
+            <w:pPr>
+              <w:spacing w:before="60" w:after="60"/>
+              <w:jc w:val="both"/>
+            </w:pPr>
+            <w:r>
+              <w:rPr>
+                <w:b/>
+                <w:color w:val="3A527C"/>
+                <w:sz w:val="15"/>
+              </w:rPr>
+              <w:t>cancelacionFallaUsuarioIncorrecto</w:t>
+            </w:r>
+          </w:p>
+        </w:tc>
+        <w:tc>
+          <w:tcPr>
+            <w:tcW w:w="4533" w:type="dxa"/>
+            <w:shd w:val="clear" w:color="auto" w:fill="F5F7FA"/>
+          </w:tcPr>
+          <w:p>
+            <w:pPr>
+              <w:spacing w:before="60" w:after="60"/>
+              <w:jc w:val="both"/>
+              <w:rPr>
+                <w:lang w:val="es-GT"/>
+              </w:rPr>
+            </w:pPr>
+            <w:r>
+              <w:rPr>
+                <w:color w:val="1A1A1A"/>
+                <w:sz w:val="17"/>
+                <w:lang w:val="es-GT"/>
+              </w:rPr>
+              <w:t xml:space="preserve">Lanza IllegalArgumentException con usuario incorrecto y Oracle no cambia el estado de la reservacion.</w:t>
+            </w:r>
+            <w:proofErr w:type="spellStart"/>
+            <w:r>
+              <w:rPr>
+                <w:color w:val="1A1A1A"/>
+                <w:sz w:val="17"/>
+                <w:lang w:val="es-GT"/>
+              </w:rPr>
+              <w:t/>
+            </w:r>
+            <w:proofErr w:type="spellEnd"/>
+            <w:r>
+              <w:rPr>
+                <w:color w:val="1A1A1A"/>
+                <w:sz w:val="17"/>
+                <w:lang w:val="es-GT"/>
+              </w:rPr>
+              <w:t xml:space="preserve"/>
+            </w:r>
+          </w:p>
+        </w:tc>
+      </w:tr>
+      <w:tr>
+        <w:trPr>
+          <w:jc w:val="center"/>
+        </w:trPr>
+        <w:tc>
+          <w:tcPr>
+            <w:tcW w:w="4533" w:type="dxa"/>
+            <w:shd w:val="clear" w:color="auto" w:fill="F5F7FA"/>
+          </w:tcPr>
+          <w:p>
+            <w:pPr>
+              <w:spacing w:before="60" w:after="60"/>
+              <w:jc w:val="both"/>
+            </w:pPr>
+            <w:r>
+              <w:rPr>
+                <w:b/>
+                <w:color w:val="3A527C"/>
+                <w:sz w:val="15"/>
+              </w:rPr>
+              <w:t>cancelacionFallaMenosDe24Horas</w:t>
+            </w:r>
+          </w:p>
+        </w:tc>
+        <w:tc>
+          <w:tcPr>
+            <w:tcW w:w="4533" w:type="dxa"/>
+            <w:shd w:val="clear" w:color="auto" w:fill="F5F7FA"/>
+          </w:tcPr>
+          <w:p>
+            <w:pPr>
+              <w:spacing w:before="60" w:after="60"/>
+              <w:jc w:val="both"/>
+              <w:rPr>
+                <w:lang w:val="es-GT"/>
+              </w:rPr>
+            </w:pPr>
+            <w:r>
+              <w:rPr>
+                <w:color w:val="1A1A1A"/>
+                <w:sz w:val="17"/>
+                <w:lang w:val="es-GT"/>
+              </w:rPr>
+              <w:t xml:space="preserve">Lanza IllegalArgumentException con check-in hoy y Oracle mantiene el estado Confirmada sin modificaciones.</w:t>
+            </w:r>
+            <w:proofErr w:type="spellStart"/>
+            <w:r>
+              <w:rPr>
+                <w:color w:val="1A1A1A"/>
+                <w:sz w:val="17"/>
+                <w:lang w:val="es-GT"/>
+              </w:rPr>
+              <w:t/>
+            </w:r>
+            <w:proofErr w:type="spellEnd"/>
+            <w:r>
+              <w:rPr>
+                <w:color w:val="1A1A1A"/>
+                <w:sz w:val="17"/>
+                <w:lang w:val="es-GT"/>
+              </w:rPr>
+              <w:t xml:space="preserve"/>
+            </w:r>
+          </w:p>
+        </w:tc>
+      </w:tr>
+    </w:tbl>
+    <w:p/>
+    <w:p>
+      <w:pPr>
+        <w:pBdr>
+          <w:bottom w:val="single" w:sz="4" w:space="4" w:color="1E283C"/>
+        </w:pBdr>
+        <w:spacing w:before="200" w:after="40"/>
+        <w:jc w:val="both"/>
+      </w:pPr>
+      <w:proofErr w:type="spellStart"/>
+      <w:proofErr w:type="gramStart"/>
+      <w:r>
+        <w:rPr>
+          <w:b/>
+          <w:color w:val="1E283C"/>
+        </w:rPr>
+        <w:t>PagoServiceIntegrationTest</w:t>
+      </w:r>
+      <w:proofErr w:type="spellEnd"/>
+      <w:r>
+        <w:rPr>
+          <w:i/>
+          <w:color w:val="445060"/>
+          <w:sz w:val="18"/>
+        </w:rPr>
+        <w:t xml:space="preserve">  [Integracion  •</w:t>
+      </w:r>
+      <w:proofErr w:type="gramEnd"/>
+      <w:r>
+        <w:rPr>
+          <w:i/>
+          <w:color w:val="445060"/>
+          <w:sz w:val="18"/>
+        </w:rPr>
+        <w:t xml:space="preserve">  3 tests]</w:t>
+      </w:r>
+    </w:p>
+    <w:tbl>
+      <w:tblPr>
+        <w:tblStyle w:val="Tablaconcuadrcula"/>
+        <w:tblW w:w="0" w:type="auto"/>
+        <w:jc w:val="center"/>
+        <w:tblLook w:val="04A0" w:firstRow="1" w:lastRow="0" w:firstColumn="1" w:lastColumn="0" w:noHBand="0" w:noVBand="1"/>
+      </w:tblPr>
+      <w:tblGrid>
+        <w:gridCol w:w="5361"/>
+        <w:gridCol w:w="3695"/>
+      </w:tblGrid>
+      <w:tr>
+        <w:trPr>
+          <w:jc w:val="center"/>
+        </w:trPr>
+        <w:tc>
+          <w:tcPr>
+            <w:tcW w:w="3685" w:type="dxa"/>
+            <w:shd w:val="clear" w:color="auto" w:fill="2C3A52"/>
+          </w:tcPr>
+          <w:p>
+            <w:pPr>
+              <w:spacing w:before="60" w:after="60"/>
+              <w:jc w:val="both"/>
+            </w:pPr>
+            <w:r>
+              <w:rPr>
+                <w:b/>
+                <w:color w:val="FFFFFF"/>
+                <w:sz w:val="17"/>
+              </w:rPr>
+              <w:t>Nombre del test</w:t>
+            </w:r>
+          </w:p>
+        </w:tc>
+        <w:tc>
+          <w:tcPr>
+            <w:tcW w:w="4762" w:type="dxa"/>
+            <w:shd w:val="clear" w:color="auto" w:fill="2C3A52"/>
+          </w:tcPr>
+          <w:p>
+            <w:pPr>
+              <w:spacing w:before="60" w:after="60"/>
+              <w:jc w:val="both"/>
+            </w:pPr>
+            <w:r>
+              <w:rPr>
+                <w:b/>
+                <w:color w:val="FFFFFF"/>
+                <w:sz w:val="17"/>
+              </w:rPr>
+              <w:t>Que verifica</w:t>
+            </w:r>
+          </w:p>
+        </w:tc>
+      </w:tr>
+      <w:tr>
+        <w:trPr>
+          <w:jc w:val="center"/>
+        </w:trPr>
+        <w:tc>
+          <w:tcPr>
+            <w:tcW w:w="4533" w:type="dxa"/>
+            <w:shd w:val="clear" w:color="auto" w:fill="F5F7FA"/>
+          </w:tcPr>
+          <w:p>
+            <w:pPr>
+              <w:spacing w:before="60" w:after="60"/>
+              <w:jc w:val="both"/>
+            </w:pPr>
+            <w:r>
+              <w:rPr>
+                <w:b/>
+                <w:color w:val="3A527C"/>
+                <w:sz w:val="15"/>
+              </w:rPr>
+              <w:t>pagoExitosoConfirmaReservacionYCreaFactura</w:t>
+            </w:r>
+          </w:p>
+        </w:tc>
+        <w:tc>
+          <w:tcPr>
+            <w:tcW w:w="4533" w:type="dxa"/>
+            <w:shd w:val="clear" w:color="auto" w:fill="F5F7FA"/>
+          </w:tcPr>
+          <w:p>
+            <w:pPr>
+              <w:spacing w:before="60" w:after="60"/>
+              <w:jc w:val="both"/>
+              <w:rPr>
+                <w:lang w:val="es-GT"/>
+              </w:rPr>
+            </w:pPr>
+            <w:r>
+              <w:rPr>
+                <w:color w:val="1A1A1A"/>
+                <w:sz w:val="17"/>
+                <w:lang w:val="es-GT"/>
+              </w:rPr>
+              <w:t xml:space="preserve">Pago exitoso contra Oracle: la reservacion cambia a estado Confirmada y se crea la factura en la tabla Factura.</w:t>
+            </w:r>
+            <w:proofErr w:type="spellStart"/>
+            <w:r>
+              <w:rPr>
+                <w:color w:val="1A1A1A"/>
+                <w:sz w:val="17"/>
+                <w:lang w:val="es-GT"/>
+              </w:rPr>
+              <w:t/>
+            </w:r>
+            <w:proofErr w:type="spellEnd"/>
+            <w:r>
+              <w:rPr>
+                <w:color w:val="1A1A1A"/>
+                <w:sz w:val="17"/>
+                <w:lang w:val="es-GT"/>
+              </w:rPr>
+              <w:t xml:space="preserve"/>
+            </w:r>
+          </w:p>
+        </w:tc>
+      </w:tr>
+      <w:tr>
+        <w:trPr>
+          <w:jc w:val="center"/>
+        </w:trPr>
+        <w:tc>
+          <w:tcPr>
+            <w:tcW w:w="4533" w:type="dxa"/>
+            <w:shd w:val="clear" w:color="auto" w:fill="F5F7FA"/>
+          </w:tcPr>
+          <w:p>
+            <w:pPr>
+              <w:spacing w:before="60" w:after="60"/>
+              <w:jc w:val="both"/>
+            </w:pPr>
+            <w:r>
+              <w:rPr>
+                <w:b/>
+                <w:color w:val="3A527C"/>
+                <w:sz w:val="15"/>
+              </w:rPr>
+              <w:t>pagoFallaReservacionDeOtroUsuario</w:t>
+            </w:r>
+          </w:p>
+        </w:tc>
+        <w:tc>
+          <w:tcPr>
+            <w:tcW w:w="4533" w:type="dxa"/>
+            <w:shd w:val="clear" w:color="auto" w:fill="F5F7FA"/>
+          </w:tcPr>
+          <w:p>
+            <w:pPr>
+              <w:spacing w:before="60" w:after="60"/>
+              <w:jc w:val="both"/>
+              <w:rPr>
+                <w:lang w:val="es-GT"/>
+              </w:rPr>
+            </w:pPr>
+            <w:r>
+              <w:rPr>
+                <w:color w:val="1A1A1A"/>
+                <w:sz w:val="17"/>
+                <w:lang w:val="es-GT"/>
+              </w:rPr>
+              <w:t xml:space="preserve">Lanza IllegalArgumentException cuando la reservacion no pertenece al usuario y Oracle no crea ninguna factura.</w:t>
+            </w:r>
+            <w:proofErr w:type="spellStart"/>
+            <w:r>
+              <w:rPr>
+                <w:color w:val="1A1A1A"/>
+                <w:sz w:val="17"/>
+                <w:lang w:val="es-GT"/>
+              </w:rPr>
+              <w:t/>
+            </w:r>
+            <w:proofErr w:type="spellEnd"/>
+            <w:r>
+              <w:rPr>
+                <w:color w:val="1A1A1A"/>
+                <w:sz w:val="17"/>
+                <w:lang w:val="es-GT"/>
+              </w:rPr>
+              <w:t xml:space="preserve"/>
+            </w:r>
+          </w:p>
+        </w:tc>
+      </w:tr>
+      <w:tr>
+        <w:trPr>
+          <w:jc w:val="center"/>
+        </w:trPr>
+        <w:tc>
+          <w:tcPr>
+            <w:tcW w:w="4533" w:type="dxa"/>
+            <w:shd w:val="clear" w:color="auto" w:fill="F5F7FA"/>
+          </w:tcPr>
+          <w:p>
+            <w:pPr>
+              <w:spacing w:before="60" w:after="60"/>
+              <w:jc w:val="both"/>
+            </w:pPr>
+            <w:r>
+              <w:rPr>
+                <w:b/>
+                <w:color w:val="3A527C"/>
+                <w:sz w:val="15"/>
+              </w:rPr>
+              <w:t>pagoFallaCvvInvalido</w:t>
+            </w:r>
+          </w:p>
+        </w:tc>
+        <w:tc>
+          <w:tcPr>
+            <w:tcW w:w="4533" w:type="dxa"/>
+            <w:shd w:val="clear" w:color="auto" w:fill="F5F7FA"/>
+          </w:tcPr>
+          <w:p>
+            <w:pPr>
+              <w:spacing w:before="60" w:after="60"/>
+              <w:jc w:val="both"/>
+              <w:rPr>
+                <w:lang w:val="es-GT"/>
+              </w:rPr>
+            </w:pPr>
+            <w:r>
+              <w:rPr>
+                <w:color w:val="1A1A1A"/>
+                <w:sz w:val="17"/>
+                <w:lang w:val="es-GT"/>
+              </w:rPr>
+              <w:t xml:space="preserve">Lanza IllegalArgumentException con CVV invalido y Oracle mantiene la reservacion en estado Pendiente sin factura.</w:t>
+            </w:r>
+            <w:proofErr w:type="spellStart"/>
+            <w:r>
+              <w:rPr>
+                <w:color w:val="1A1A1A"/>
+                <w:sz w:val="17"/>
+                <w:lang w:val="es-GT"/>
+              </w:rPr>
+              <w:t/>
+            </w:r>
+            <w:proofErr w:type="spellEnd"/>
+            <w:r>
+              <w:rPr>
+                <w:color w:val="1A1A1A"/>
+                <w:sz w:val="17"/>
+                <w:lang w:val="es-GT"/>
+              </w:rPr>
+              <w:t xml:space="preserve"/>
+            </w:r>
+          </w:p>
+        </w:tc>
+      </w:tr>
+    </w:tbl>
+    <w:p/>
+    <w:p>
+      <w:pPr>
+        <w:pBdr>
+          <w:bottom w:val="single" w:sz="4" w:space="4" w:color="1E283C"/>
+        </w:pBdr>
+        <w:spacing w:before="200" w:after="40"/>
+        <w:jc w:val="both"/>
+      </w:pPr>
+      <w:proofErr w:type="spellStart"/>
+      <w:proofErr w:type="gramStart"/>
+      <w:r>
+        <w:rPr>
+          <w:b/>
+          <w:color w:val="1E283C"/>
+        </w:rPr>
+        <w:t>ReservacionServiceIntegrationTest</w:t>
+      </w:r>
+      <w:proofErr w:type="spellEnd"/>
+      <w:r>
+        <w:rPr>
+          <w:i/>
+          <w:color w:val="445060"/>
+          <w:sz w:val="18"/>
+        </w:rPr>
+        <w:t xml:space="preserve">  [Integracion  •</w:t>
+      </w:r>
+      <w:proofErr w:type="gramEnd"/>
+      <w:r>
+        <w:rPr>
+          <w:i/>
+          <w:color w:val="445060"/>
+          <w:sz w:val="18"/>
+        </w:rPr>
+        <w:t xml:space="preserve">  3 tests]</w:t>
+      </w:r>
+    </w:p>
+    <w:tbl>
+      <w:tblPr>
+        <w:tblStyle w:val="Tablaconcuadrcula"/>
+        <w:tblW w:w="0" w:type="auto"/>
+        <w:jc w:val="center"/>
+        <w:tblLook w:val="04A0" w:firstRow="1" w:lastRow="0" w:firstColumn="1" w:lastColumn="0" w:noHBand="0" w:noVBand="1"/>
+      </w:tblPr>
+      <w:tblGrid>
+        <w:gridCol w:w="5361"/>
+        <w:gridCol w:w="3695"/>
+      </w:tblGrid>
+      <w:tr>
+        <w:trPr>
+          <w:jc w:val="center"/>
+        </w:trPr>
+        <w:tc>
+          <w:tcPr>
+            <w:tcW w:w="3685" w:type="dxa"/>
+            <w:shd w:val="clear" w:color="auto" w:fill="2C3A52"/>
+          </w:tcPr>
+          <w:p>
+            <w:pPr>
+              <w:spacing w:before="60" w:after="60"/>
+              <w:jc w:val="both"/>
+            </w:pPr>
+            <w:r>
+              <w:rPr>
+                <w:b/>
+                <w:color w:val="FFFFFF"/>
+                <w:sz w:val="17"/>
+              </w:rPr>
+              <w:t>Nombre del test</w:t>
+            </w:r>
+          </w:p>
+        </w:tc>
+        <w:tc>
+          <w:tcPr>
+            <w:tcW w:w="4762" w:type="dxa"/>
+            <w:shd w:val="clear" w:color="auto" w:fill="2C3A52"/>
+          </w:tcPr>
+          <w:p>
+            <w:pPr>
+              <w:spacing w:before="60" w:after="60"/>
+              <w:jc w:val="both"/>
+            </w:pPr>
+            <w:r>
+              <w:rPr>
+                <w:b/>
+                <w:color w:val="FFFFFF"/>
+                <w:sz w:val="17"/>
+              </w:rPr>
+              <w:t>Que verifica</w:t>
+            </w:r>
+          </w:p>
+        </w:tc>
+      </w:tr>
+      <w:tr>
+        <w:trPr>
+          <w:jc w:val="center"/>
+        </w:trPr>
+        <w:tc>
+          <w:tcPr>
+            <w:tcW w:w="4533" w:type="dxa"/>
+            <w:shd w:val="clear" w:color="auto" w:fill="F5F7FA"/>
+          </w:tcPr>
+          <w:p>
+            <w:pPr>
+              <w:spacing w:before="60" w:after="60"/>
+              <w:jc w:val="both"/>
+            </w:pPr>
+            <w:r>
+              <w:rPr>
+                <w:b/>
+                <w:color w:val="3A527C"/>
+                <w:sz w:val="15"/>
+              </w:rPr>
+              <w:t>crearReservacionExitosa</w:t>
+            </w:r>
+          </w:p>
+        </w:tc>
+        <w:tc>
+          <w:tcPr>
+            <w:tcW w:w="4533" w:type="dxa"/>
+            <w:shd w:val="clear" w:color="auto" w:fill="F5F7FA"/>
+          </w:tcPr>
+          <w:p>
+            <w:pPr>
+              <w:spacing w:before="60" w:after="60"/>
+              <w:jc w:val="both"/>
+              <w:rPr>
+                <w:lang w:val="es-GT"/>
+              </w:rPr>
+            </w:pPr>
+            <w:r>
+              <w:rPr>
+                <w:color w:val="1A1A1A"/>
+                <w:sz w:val="17"/>
+                <w:lang w:val="es-GT"/>
+              </w:rPr>
+              <w:t xml:space="preserve">Crea reservacion real en Oracle con prefijo MIKU-, estado pendiente y total mayor a cero; el registro queda persistido.</w:t>
+            </w:r>
+            <w:proofErr w:type="spellStart"/>
+            <w:r>
+              <w:rPr>
+                <w:color w:val="1A1A1A"/>
+                <w:sz w:val="17"/>
+                <w:lang w:val="es-GT"/>
+              </w:rPr>
+              <w:t/>
+            </w:r>
+            <w:proofErr w:type="spellEnd"/>
+            <w:r>
+              <w:rPr>
+                <w:color w:val="1A1A1A"/>
+                <w:sz w:val="17"/>
+                <w:lang w:val="es-GT"/>
+              </w:rPr>
+              <w:t xml:space="preserve"/>
+            </w:r>
+          </w:p>
+        </w:tc>
+      </w:tr>
+      <w:tr>
+        <w:trPr>
+          <w:jc w:val="center"/>
+        </w:trPr>
+        <w:tc>
+          <w:tcPr>
+            <w:tcW w:w="4533" w:type="dxa"/>
+            <w:shd w:val="clear" w:color="auto" w:fill="F5F7FA"/>
+          </w:tcPr>
+          <w:p>
+            <w:pPr>
+              <w:spacing w:before="60" w:after="60"/>
+              <w:jc w:val="both"/>
+            </w:pPr>
+            <w:r>
+              <w:rPr>
+                <w:b/>
+                <w:color w:val="3A527C"/>
+                <w:sz w:val="15"/>
+              </w:rPr>
+              <w:t>crearReservacionFallaSinHabitaciones</w:t>
+            </w:r>
+          </w:p>
+        </w:tc>
+        <w:tc>
+          <w:tcPr>
+            <w:tcW w:w="4533" w:type="dxa"/>
+            <w:shd w:val="clear" w:color="auto" w:fill="F5F7FA"/>
+          </w:tcPr>
+          <w:p>
+            <w:pPr>
+              <w:spacing w:before="60" w:after="60"/>
+              <w:jc w:val="both"/>
+              <w:rPr>
+                <w:lang w:val="es-GT"/>
+              </w:rPr>
+            </w:pPr>
+            <w:r>
+              <w:rPr>
+                <w:color w:val="1A1A1A"/>
+                <w:sz w:val="17"/>
+                <w:lang w:val="es-GT"/>
+              </w:rPr>
+              <w:t xml:space="preserve">Lanza IllegalArgumentException sin habitaciones en el request y Oracle no recibe ninguna insercion.</w:t>
+            </w:r>
+            <w:proofErr w:type="spellStart"/>
+            <w:r>
+              <w:rPr>
+                <w:color w:val="1A1A1A"/>
+                <w:sz w:val="17"/>
+                <w:lang w:val="es-GT"/>
+              </w:rPr>
+              <w:t/>
+            </w:r>
+            <w:proofErr w:type="spellEnd"/>
+            <w:r>
+              <w:rPr>
+                <w:color w:val="1A1A1A"/>
+                <w:sz w:val="17"/>
+                <w:lang w:val="es-GT"/>
+              </w:rPr>
+              <w:t xml:space="preserve"/>
+            </w:r>
+          </w:p>
+        </w:tc>
+      </w:tr>
+      <w:tr>
+        <w:trPr>
+          <w:jc w:val="center"/>
+        </w:trPr>
+        <w:tc>
+          <w:tcPr>
+            <w:tcW w:w="4533" w:type="dxa"/>
+            <w:shd w:val="clear" w:color="auto" w:fill="F5F7FA"/>
+          </w:tcPr>
+          <w:p>
+            <w:pPr>
+              <w:spacing w:before="60" w:after="60"/>
+              <w:jc w:val="both"/>
+            </w:pPr>
+            <w:r>
+              <w:rPr>
+                <w:b/>
+                <w:color w:val="3A527C"/>
+                <w:sz w:val="15"/>
+              </w:rPr>
+              <w:t>crearReservacionFallaFechaPasada</w:t>
+            </w:r>
+          </w:p>
+        </w:tc>
+        <w:tc>
+          <w:tcPr>
+            <w:tcW w:w="4533" w:type="dxa"/>
+            <w:shd w:val="clear" w:color="auto" w:fill="F5F7FA"/>
+          </w:tcPr>
+          <w:p>
+            <w:pPr>
+              <w:spacing w:before="60" w:after="60"/>
+              <w:jc w:val="both"/>
+              <w:rPr>
+                <w:lang w:val="es-GT"/>
+              </w:rPr>
+            </w:pPr>
+            <w:r>
+              <w:rPr>
+                <w:color w:val="1A1A1A"/>
+                <w:sz w:val="17"/>
+                <w:lang w:val="es-GT"/>
+              </w:rPr>
+              <w:t xml:space="preserve">Lanza IllegalArgumentException con check-in en el pasado y Oracle no recibe ninguna insercion.</w:t>
+            </w:r>
+            <w:proofErr w:type="spellStart"/>
+            <w:r>
+              <w:rPr>
+                <w:color w:val="1A1A1A"/>
+                <w:sz w:val="17"/>
+                <w:lang w:val="es-GT"/>
+              </w:rPr>
+              <w:t/>
+            </w:r>
+            <w:proofErr w:type="spellEnd"/>
+            <w:r>
+              <w:rPr>
+                <w:color w:val="1A1A1A"/>
+                <w:sz w:val="17"/>
+                <w:lang w:val="es-GT"/>
+              </w:rPr>
+              <w:t xml:space="preserve"/>
+            </w:r>
+          </w:p>
+        </w:tc>
+      </w:tr>
+    </w:tbl>
+    <w:p/>
+    <w:p>
+      <w:pPr>
+        <w:pBdr>
+          <w:bottom w:val="single" w:sz="4" w:space="4" w:color="1E283C"/>
+        </w:pBdr>
+        <w:spacing w:before="200" w:after="40"/>
+        <w:jc w:val="both"/>
+      </w:pPr>
+      <w:proofErr w:type="spellStart"/>
+      <w:proofErr w:type="gramStart"/>
+      <w:r>
+        <w:rPr>
+          <w:b/>
+          <w:color w:val="1E283C"/>
+        </w:rPr>
         <w:t>CombinacionHelperTest</w:t>
       </w:r>
       <w:proofErr w:type="spellEnd"/>
@@ -22466,7 +24214,7 @@
           <w:sz w:val="20"/>
           <w:lang w:val="es-GT"/>
         </w:rPr>
-        <w:t xml:space="preserve">/ fue modificado. Las 229 pruebas validan el comportamiento real del </w:t>
+        <w:t xml:space="preserve">/ fue modificado. Las 249 pruebas validan el comportamiento real del </w:t>
       </w:r>
       <w:proofErr w:type="spellStart"/>
       <w:r>
@@ -23333,7 +25081,7 @@
           <w:sz w:val="20"/>
           <w:lang w:val="es-GT"/>
         </w:rPr>
-        <w:t xml:space="preserve">Las 229 pruebas unitarias del microservicio Hotel de Miku Inn pasaron satisfactoriamente en 41.2 segundos, cubriendo los 30 componentes clave del sistema. La </w:t>
+        <w:t xml:space="preserve">Las 249 pruebas unitarias del microservicio Hotel de Miku Inn pasaron satisfactoriamente en 54.504 segundos, cubriendo los 35 componentes clave del sistema. La </w:t>
       </w:r>
       <w:proofErr w:type="spellStart"/>
       <w:r>

</xml_diff>